<commit_message>
feat: auf du umgestellt
</commit_message>
<xml_diff>
--- a/reli-kirche-und-staat/word/DS1-Kopiervorlagen-Kirche-und-Staat.docx
+++ b/reli-kirche-und-staat/word/DS1-Kopiervorlagen-Kirche-und-Staat.docx
@@ -820,7 +820,7 @@
                 <w:b w:val="0"/>
                 <w:i w:val="0"/>
               </w:rPr>
-              <w:t xml:space="preserve">Die Faksimiles (Folien 1, 2, 5, 6) sind als Muster gestaltet und ausdrücklich als solche gekennzeichnet — sie bilden keine echten Dokumente ab. Die Kirchensteuerbeträge auf Folie 1 sind ein gerundetes Rechenbeispiel für Bayern (8 % der Lohnsteuer) und dienen der Anschauung, nicht der exakten Berechnung. Die Formulierung auf Folie 5 fasst die Regelung des Bayerischen Feiertagsgesetzes zusammen; wenn Sie den Gesetzeswortlaut zeigen möchten, setzen Sie ihn von </w:t>
+              <w:t xml:space="preserve">Die Faksimiles (Folien 1, 2, 5, 6) sind als Muster gestaltet und ausdrücklich als solche gekennzeichnet — sie bilden keine echten Dokumente ab. Die Kirchensteuerbeträge auf Folie 1 sind ein gerundetes Rechenbeispiel für Bayern (8 % der Lohnsteuer) und dienen der Anschauung, nicht der exakten Berechnung. Die Formulierung auf Folie 5 fasst die Regelung des Bayerischen Feiertagsgesetzes zusammen; wenn du den Gesetzeswortlaut zeigen möchtest, setz ihn von </w:t>
             </w:r>
             <w:r>
               <w:rPr>
@@ -5908,7 +5908,7 @@
           <w:b w:val="0"/>
           <w:i w:val="0"/>
         </w:rPr>
-        <w:t xml:space="preserve"> einblenden, dann positionieren lassen. Nach jedem Satz aus zwei verschiedenen Ecken je eine Begründung hören und anschließend fragen: „Wer hat ein Argument gehört, das ihn ins Wanken bringt? Wechseln Sie die Ecke.“</w:t>
+        <w:t xml:space="preserve"> einblenden, dann positionieren lassen. Nach jedem Satz aus zwei verschiedenen Ecken je eine Begründung hören und anschließend fragen: „Wer hat ein Argument gehört, das ihn ins Wanken bringt? Wechselt die Ecke.“</w:t>
       </w:r>
     </w:p>
     <w:p>

</xml_diff>